<commit_message>
fix: alguns endpoints ainda nao funcionando
</commit_message>
<xml_diff>
--- a/batchs mais utilizados.docx
+++ b/batchs mais utilizados.docx
@@ -1376,7 +1376,25 @@
           <w:szCs w:val="24"/>
           <w:lang w:eastAsia="pt-BR"/>
         </w:rPr>
-        <w:t>./e2e/drop-and-create-db-auto.sh</w:t>
+        <w:t>./</w:t>
+      </w:r>
+      <w:r>
+        <w:rPr>
+          <w:rFonts w:ascii="Segoe UI Emoji" w:eastAsia="Times New Roman" w:hAnsi="Segoe UI Emoji" w:cs="Segoe UI Emoji"/>
+          <w:sz w:val="24"/>
+          <w:szCs w:val="24"/>
+          <w:lang w:eastAsia="pt-BR"/>
+        </w:rPr>
+        <w:t>scripts</w:t>
+      </w:r>
+      <w:r>
+        <w:rPr>
+          <w:rFonts w:ascii="Segoe UI Emoji" w:eastAsia="Times New Roman" w:hAnsi="Segoe UI Emoji" w:cs="Segoe UI Emoji"/>
+          <w:sz w:val="24"/>
+          <w:szCs w:val="24"/>
+          <w:lang w:eastAsia="pt-BR"/>
+        </w:rPr>
+        <w:t>/drop-and-create-db-auto.sh</w:t>
       </w:r>
     </w:p>
     <w:p>
@@ -1388,6 +1406,43 @@
           <w:lang w:eastAsia="pt-BR"/>
         </w:rPr>
       </w:pPr>
+    </w:p>
+    <w:p>
+      <w:pPr>
+        <w:rPr>
+          <w:rFonts w:ascii="Segoe UI Emoji" w:eastAsia="Times New Roman" w:hAnsi="Segoe UI Emoji" w:cs="Segoe UI Emoji"/>
+          <w:sz w:val="24"/>
+          <w:szCs w:val="24"/>
+          <w:lang w:eastAsia="pt-BR"/>
+        </w:rPr>
+      </w:pPr>
+      <w:r>
+        <w:rPr>
+          <w:rFonts w:ascii="Segoe UI Emoji" w:eastAsia="Times New Roman" w:hAnsi="Segoe UI Emoji" w:cs="Segoe UI Emoji"/>
+          <w:sz w:val="24"/>
+          <w:szCs w:val="24"/>
+          <w:lang w:eastAsia="pt-BR"/>
+        </w:rPr>
+        <w:t>Somente dropa o banco</w:t>
+      </w:r>
+      <w:r>
+        <w:rPr>
+          <w:rFonts w:ascii="Segoe UI Emoji" w:eastAsia="Times New Roman" w:hAnsi="Segoe UI Emoji" w:cs="Segoe UI Emoji"/>
+          <w:sz w:val="24"/>
+          <w:szCs w:val="24"/>
+          <w:lang w:eastAsia="pt-BR"/>
+        </w:rPr>
+        <w:br/>
+      </w:r>
+      <w:r>
+        <w:rPr>
+          <w:rFonts w:ascii="Segoe UI Emoji" w:eastAsia="Times New Roman" w:hAnsi="Segoe UI Emoji" w:cs="Segoe UI Emoji"/>
+          <w:sz w:val="24"/>
+          <w:szCs w:val="24"/>
+          <w:lang w:eastAsia="pt-BR"/>
+        </w:rPr>
+        <w:t>./scripts/drop-db-only.sh</w:t>
+      </w:r>
     </w:p>
     <w:p>
       <w:pPr>
@@ -5341,7 +5396,6 @@
   <w:style w:type="character" w:default="1" w:styleId="Fontepargpadro">
     <w:name w:val="Default Paragraph Font"/>
     <w:uiPriority w:val="1"/>
-    <w:semiHidden/>
     <w:unhideWhenUsed/>
   </w:style>
   <w:style w:type="table" w:default="1" w:styleId="Tabelanormal">

</xml_diff>

<commit_message>
ajustando suites v32.4 e v100.9.1
</commit_message>
<xml_diff>
--- a/batchs mais utilizados.docx
+++ b/batchs mais utilizados.docx
@@ -2,6 +2,599 @@
 <file path=word/document.xml><?xml version="1.0" encoding="utf-8"?>
 <w:document xmlns:wpc="http://schemas.microsoft.com/office/word/2010/wordprocessingCanvas" xmlns:cx="http://schemas.microsoft.com/office/drawing/2014/chartex" xmlns:cx1="http://schemas.microsoft.com/office/drawing/2015/9/8/chartex" xmlns:cx2="http://schemas.microsoft.com/office/drawing/2015/10/21/chartex" xmlns:cx3="http://schemas.microsoft.com/office/drawing/2016/5/9/chartex" xmlns:cx4="http://schemas.microsoft.com/office/drawing/2016/5/10/chartex" xmlns:cx5="http://schemas.microsoft.com/office/drawing/2016/5/11/chartex" xmlns:cx6="http://schemas.microsoft.com/office/drawing/2016/5/12/chartex" xmlns:cx7="http://schemas.microsoft.com/office/drawing/2016/5/13/chartex" xmlns:cx8="http://schemas.microsoft.com/office/drawing/2016/5/14/chartex" xmlns:mc="http://schemas.openxmlformats.org/markup-compatibility/2006" xmlns:aink="http://schemas.microsoft.com/office/drawing/2016/ink" xmlns:am3d="http://schemas.microsoft.com/office/drawing/2017/model3d" xmlns:o="urn:schemas-microsoft-com:office:office" xmlns:oel="http://schemas.microsoft.com/office/2019/extlst" xmlns:r="http://schemas.openxmlformats.org/officeDocument/2006/relationships" xmlns:m="http://schemas.openxmlformats.org/officeDocument/2006/math" xmlns:v="urn:schemas-microsoft-com:vml" xmlns:wp14="http://schemas.microsoft.com/office/word/2010/wordprocessingDrawing" xmlns:wp="http://schemas.openxmlformats.org/drawingml/2006/wordprocessingDrawing" xmlns:w10="urn:schemas-microsoft-com:office:word" xmlns:w="http://schemas.openxmlformats.org/wordprocessingml/2006/main" xmlns:w14="http://schemas.microsoft.com/office/word/2010/wordml" xmlns:w15="http://schemas.microsoft.com/office/word/2012/wordml" xmlns:w16cex="http://schemas.microsoft.com/office/word/2018/wordml/cex" xmlns:w16cid="http://schemas.microsoft.com/office/word/2016/wordml/cid" xmlns:w16="http://schemas.microsoft.com/office/word/2018/wordml" xmlns:w16du="http://schemas.microsoft.com/office/word/2023/wordml/word16du" xmlns:w16sdtdh="http://schemas.microsoft.com/office/word/2020/wordml/sdtdatahash" xmlns:w16sdtfl="http://schemas.microsoft.com/office/word/2024/wordml/sdtformatlock" xmlns:w16se="http://schemas.microsoft.com/office/word/2015/wordml/symex" xmlns:wpg="http://schemas.microsoft.com/office/word/2010/wordprocessingGroup" xmlns:wpi="http://schemas.microsoft.com/office/word/2010/wordprocessingInk" xmlns:wne="http://schemas.microsoft.com/office/word/2006/wordml" xmlns:wps="http://schemas.microsoft.com/office/word/2010/wordprocessingShape" mc:Ignorable="w14 w15 w16se w16cid w16 w16cex w16sdtdh w16sdtfl w16du wp14">
   <w:body>
+    <w:p>
+      <w:pPr>
+        <w:rPr>
+          <w:rFonts w:ascii="Segoe UI Emoji" w:eastAsia="Times New Roman" w:hAnsi="Segoe UI Emoji" w:cs="Segoe UI Emoji"/>
+          <w:sz w:val="24"/>
+          <w:szCs w:val="24"/>
+          <w:lang w:eastAsia="pt-BR"/>
+        </w:rPr>
+      </w:pPr>
+      <w:r>
+        <w:rPr>
+          <w:rFonts w:ascii="Segoe UI Emoji" w:eastAsia="Times New Roman" w:hAnsi="Segoe UI Emoji" w:cs="Segoe UI Emoji"/>
+          <w:sz w:val="24"/>
+          <w:szCs w:val="24"/>
+          <w:lang w:eastAsia="pt-BR"/>
+        </w:rPr>
+        <w:t xml:space="preserve">1 – </w:t>
+      </w:r>
+      <w:proofErr w:type="gramStart"/>
+      <w:r>
+        <w:rPr>
+          <w:rFonts w:ascii="Segoe UI Emoji" w:eastAsia="Times New Roman" w:hAnsi="Segoe UI Emoji" w:cs="Segoe UI Emoji"/>
+          <w:sz w:val="24"/>
+          <w:szCs w:val="24"/>
+          <w:lang w:eastAsia="pt-BR"/>
+        </w:rPr>
+        <w:t>gerar</w:t>
+      </w:r>
+      <w:proofErr w:type="gramEnd"/>
+      <w:r>
+        <w:rPr>
+          <w:rFonts w:ascii="Segoe UI Emoji" w:eastAsia="Times New Roman" w:hAnsi="Segoe UI Emoji" w:cs="Segoe UI Emoji"/>
+          <w:sz w:val="24"/>
+          <w:szCs w:val="24"/>
+          <w:lang w:eastAsia="pt-BR"/>
+        </w:rPr>
+        <w:t xml:space="preserve"> um arquivo com todo o código</w:t>
+      </w:r>
+      <w:r>
+        <w:rPr>
+          <w:rFonts w:ascii="Segoe UI Emoji" w:eastAsia="Times New Roman" w:hAnsi="Segoe UI Emoji" w:cs="Segoe UI Emoji"/>
+          <w:sz w:val="24"/>
+          <w:szCs w:val="24"/>
+          <w:lang w:eastAsia="pt-BR"/>
+        </w:rPr>
+        <w:br/>
+      </w:r>
+      <w:proofErr w:type="spellStart"/>
+      <w:r>
+        <w:rPr>
+          <w:rFonts w:ascii="Segoe UI Emoji" w:eastAsia="Times New Roman" w:hAnsi="Segoe UI Emoji" w:cs="Segoe UI Emoji"/>
+          <w:sz w:val="24"/>
+          <w:szCs w:val="24"/>
+          <w:lang w:eastAsia="pt-BR"/>
+        </w:rPr>
+        <w:t>Usuario@SANDESK-MICRO</w:t>
+      </w:r>
+      <w:proofErr w:type="spellEnd"/>
+      <w:r>
+        <w:rPr>
+          <w:rFonts w:ascii="Segoe UI Emoji" w:eastAsia="Times New Roman" w:hAnsi="Segoe UI Emoji" w:cs="Segoe UI Emoji"/>
+          <w:sz w:val="24"/>
+          <w:szCs w:val="24"/>
+          <w:lang w:eastAsia="pt-BR"/>
+        </w:rPr>
+        <w:t xml:space="preserve"> MINGW64 ~/eclipse-</w:t>
+      </w:r>
+      <w:proofErr w:type="spellStart"/>
+      <w:r>
+        <w:rPr>
+          <w:rFonts w:ascii="Segoe UI Emoji" w:eastAsia="Times New Roman" w:hAnsi="Segoe UI Emoji" w:cs="Segoe UI Emoji"/>
+          <w:sz w:val="24"/>
+          <w:szCs w:val="24"/>
+          <w:lang w:eastAsia="pt-BR"/>
+        </w:rPr>
+        <w:t>workspace</w:t>
+      </w:r>
+      <w:proofErr w:type="spellEnd"/>
+      <w:r>
+        <w:rPr>
+          <w:rFonts w:ascii="Segoe UI Emoji" w:eastAsia="Times New Roman" w:hAnsi="Segoe UI Emoji" w:cs="Segoe UI Emoji"/>
+          <w:sz w:val="24"/>
+          <w:szCs w:val="24"/>
+          <w:lang w:eastAsia="pt-BR"/>
+        </w:rPr>
+        <w:t>/multitenancy001/scripts (</w:t>
+      </w:r>
+      <w:proofErr w:type="spellStart"/>
+      <w:r>
+        <w:rPr>
+          <w:rFonts w:ascii="Segoe UI Emoji" w:eastAsia="Times New Roman" w:hAnsi="Segoe UI Emoji" w:cs="Segoe UI Emoji"/>
+          <w:sz w:val="24"/>
+          <w:szCs w:val="24"/>
+          <w:lang w:eastAsia="pt-BR"/>
+        </w:rPr>
+        <w:t>main</w:t>
+      </w:r>
+      <w:proofErr w:type="spellEnd"/>
+      <w:r>
+        <w:rPr>
+          <w:rFonts w:ascii="Segoe UI Emoji" w:eastAsia="Times New Roman" w:hAnsi="Segoe UI Emoji" w:cs="Segoe UI Emoji"/>
+          <w:sz w:val="24"/>
+          <w:szCs w:val="24"/>
+          <w:lang w:eastAsia="pt-BR"/>
+        </w:rPr>
+        <w:t>)</w:t>
+      </w:r>
+    </w:p>
+    <w:p>
+      <w:pPr>
+        <w:rPr>
+          <w:rFonts w:ascii="Segoe UI Emoji" w:eastAsia="Times New Roman" w:hAnsi="Segoe UI Emoji" w:cs="Segoe UI Emoji"/>
+          <w:sz w:val="24"/>
+          <w:szCs w:val="24"/>
+          <w:lang w:eastAsia="pt-BR"/>
+        </w:rPr>
+      </w:pPr>
+      <w:r>
+        <w:rPr>
+          <w:rFonts w:ascii="Segoe UI Emoji" w:eastAsia="Times New Roman" w:hAnsi="Segoe UI Emoji" w:cs="Segoe UI Emoji"/>
+          <w:sz w:val="24"/>
+          <w:szCs w:val="24"/>
+          <w:lang w:eastAsia="pt-BR"/>
+        </w:rPr>
+        <w:t>$ ./export_ia.sh</w:t>
+      </w:r>
+      <w:r>
+        <w:rPr>
+          <w:rFonts w:ascii="Segoe UI Emoji" w:eastAsia="Times New Roman" w:hAnsi="Segoe UI Emoji" w:cs="Segoe UI Emoji"/>
+          <w:sz w:val="24"/>
+          <w:szCs w:val="24"/>
+          <w:lang w:eastAsia="pt-BR"/>
+        </w:rPr>
+        <w:br/>
+      </w:r>
+      <w:r>
+        <w:rPr>
+          <w:rFonts w:ascii="Segoe UI Emoji" w:eastAsia="Times New Roman" w:hAnsi="Segoe UI Emoji" w:cs="Segoe UI Emoji"/>
+          <w:sz w:val="24"/>
+          <w:szCs w:val="24"/>
+          <w:lang w:eastAsia="pt-BR"/>
+        </w:rPr>
+        <w:br/>
+        <w:t>2-rodar a suíte de carga que preenche com vários dados</w:t>
+      </w:r>
+      <w:r>
+        <w:rPr>
+          <w:rFonts w:ascii="Segoe UI Emoji" w:eastAsia="Times New Roman" w:hAnsi="Segoe UI Emoji" w:cs="Segoe UI Emoji"/>
+          <w:sz w:val="24"/>
+          <w:szCs w:val="24"/>
+          <w:lang w:eastAsia="pt-BR"/>
+        </w:rPr>
+        <w:br/>
+      </w:r>
+      <w:proofErr w:type="spellStart"/>
+      <w:r>
+        <w:rPr>
+          <w:rFonts w:ascii="Segoe UI Emoji" w:eastAsia="Times New Roman" w:hAnsi="Segoe UI Emoji" w:cs="Segoe UI Emoji"/>
+          <w:sz w:val="24"/>
+          <w:szCs w:val="24"/>
+          <w:lang w:eastAsia="pt-BR"/>
+        </w:rPr>
+        <w:t>Usuario@SANDESK-MICRO</w:t>
+      </w:r>
+      <w:proofErr w:type="spellEnd"/>
+      <w:r>
+        <w:rPr>
+          <w:rFonts w:ascii="Segoe UI Emoji" w:eastAsia="Times New Roman" w:hAnsi="Segoe UI Emoji" w:cs="Segoe UI Emoji"/>
+          <w:sz w:val="24"/>
+          <w:szCs w:val="24"/>
+          <w:lang w:eastAsia="pt-BR"/>
+        </w:rPr>
+        <w:t xml:space="preserve"> MINGW64 ~/eclipse-</w:t>
+      </w:r>
+      <w:proofErr w:type="spellStart"/>
+      <w:r>
+        <w:rPr>
+          <w:rFonts w:ascii="Segoe UI Emoji" w:eastAsia="Times New Roman" w:hAnsi="Segoe UI Emoji" w:cs="Segoe UI Emoji"/>
+          <w:sz w:val="24"/>
+          <w:szCs w:val="24"/>
+          <w:lang w:eastAsia="pt-BR"/>
+        </w:rPr>
+        <w:t>workspace</w:t>
+      </w:r>
+      <w:proofErr w:type="spellEnd"/>
+      <w:r>
+        <w:rPr>
+          <w:rFonts w:ascii="Segoe UI Emoji" w:eastAsia="Times New Roman" w:hAnsi="Segoe UI Emoji" w:cs="Segoe UI Emoji"/>
+          <w:sz w:val="24"/>
+          <w:szCs w:val="24"/>
+          <w:lang w:eastAsia="pt-BR"/>
+        </w:rPr>
+        <w:t>/multitenancy001/e2e/teste_v100.9.1 (</w:t>
+      </w:r>
+      <w:proofErr w:type="spellStart"/>
+      <w:r>
+        <w:rPr>
+          <w:rFonts w:ascii="Segoe UI Emoji" w:eastAsia="Times New Roman" w:hAnsi="Segoe UI Emoji" w:cs="Segoe UI Emoji"/>
+          <w:sz w:val="24"/>
+          <w:szCs w:val="24"/>
+          <w:lang w:eastAsia="pt-BR"/>
+        </w:rPr>
+        <w:t>main</w:t>
+      </w:r>
+      <w:proofErr w:type="spellEnd"/>
+      <w:r>
+        <w:rPr>
+          <w:rFonts w:ascii="Segoe UI Emoji" w:eastAsia="Times New Roman" w:hAnsi="Segoe UI Emoji" w:cs="Segoe UI Emoji"/>
+          <w:sz w:val="24"/>
+          <w:szCs w:val="24"/>
+          <w:lang w:eastAsia="pt-BR"/>
+        </w:rPr>
+        <w:t>)</w:t>
+      </w:r>
+    </w:p>
+    <w:p>
+      <w:pPr>
+        <w:rPr>
+          <w:rFonts w:ascii="Segoe UI Emoji" w:eastAsia="Times New Roman" w:hAnsi="Segoe UI Emoji" w:cs="Segoe UI Emoji"/>
+          <w:sz w:val="24"/>
+          <w:szCs w:val="24"/>
+          <w:lang w:eastAsia="pt-BR"/>
+        </w:rPr>
+      </w:pPr>
+      <w:r>
+        <w:rPr>
+          <w:rFonts w:ascii="Segoe UI Emoji" w:eastAsia="Times New Roman" w:hAnsi="Segoe UI Emoji" w:cs="Segoe UI Emoji"/>
+          <w:sz w:val="24"/>
+          <w:szCs w:val="24"/>
+          <w:lang w:eastAsia="pt-BR"/>
+        </w:rPr>
+        <w:t xml:space="preserve">$ </w:t>
+      </w:r>
+      <w:proofErr w:type="spellStart"/>
+      <w:r>
+        <w:rPr>
+          <w:rFonts w:ascii="Segoe UI Emoji" w:eastAsia="Times New Roman" w:hAnsi="Segoe UI Emoji" w:cs="Segoe UI Emoji"/>
+          <w:sz w:val="24"/>
+          <w:szCs w:val="24"/>
+          <w:lang w:eastAsia="pt-BR"/>
+        </w:rPr>
+        <w:t>chmod</w:t>
+      </w:r>
+      <w:proofErr w:type="spellEnd"/>
+      <w:r>
+        <w:rPr>
+          <w:rFonts w:ascii="Segoe UI Emoji" w:eastAsia="Times New Roman" w:hAnsi="Segoe UI Emoji" w:cs="Segoe UI Emoji"/>
+          <w:sz w:val="24"/>
+          <w:szCs w:val="24"/>
+          <w:lang w:eastAsia="pt-BR"/>
+        </w:rPr>
+        <w:t xml:space="preserve"> +x *.</w:t>
+      </w:r>
+      <w:proofErr w:type="spellStart"/>
+      <w:r>
+        <w:rPr>
+          <w:rFonts w:ascii="Segoe UI Emoji" w:eastAsia="Times New Roman" w:hAnsi="Segoe UI Emoji" w:cs="Segoe UI Emoji"/>
+          <w:sz w:val="24"/>
+          <w:szCs w:val="24"/>
+          <w:lang w:eastAsia="pt-BR"/>
+        </w:rPr>
+        <w:t>sh</w:t>
+      </w:r>
+      <w:proofErr w:type="spellEnd"/>
+    </w:p>
+    <w:p>
+      <w:pPr>
+        <w:rPr>
+          <w:rFonts w:ascii="Segoe UI Emoji" w:eastAsia="Times New Roman" w:hAnsi="Segoe UI Emoji" w:cs="Segoe UI Emoji"/>
+          <w:sz w:val="24"/>
+          <w:szCs w:val="24"/>
+          <w:lang w:eastAsia="pt-BR"/>
+        </w:rPr>
+      </w:pPr>
+      <w:r>
+        <w:rPr>
+          <w:rFonts w:ascii="Segoe UI Emoji" w:eastAsia="Times New Roman" w:hAnsi="Segoe UI Emoji" w:cs="Segoe UI Emoji"/>
+          <w:sz w:val="24"/>
+          <w:szCs w:val="24"/>
+          <w:lang w:eastAsia="pt-BR"/>
+        </w:rPr>
+        <w:t>./run-teste-v100.9-query-hardened-strict.sh</w:t>
+      </w:r>
+    </w:p>
+    <w:p>
+      <w:pPr>
+        <w:rPr>
+          <w:rFonts w:ascii="Segoe UI Emoji" w:eastAsia="Times New Roman" w:hAnsi="Segoe UI Emoji" w:cs="Segoe UI Emoji"/>
+          <w:sz w:val="24"/>
+          <w:szCs w:val="24"/>
+          <w:lang w:eastAsia="pt-BR"/>
+        </w:rPr>
+      </w:pPr>
+    </w:p>
+    <w:p>
+      <w:pPr>
+        <w:rPr>
+          <w:rFonts w:ascii="Segoe UI Emoji" w:eastAsia="Times New Roman" w:hAnsi="Segoe UI Emoji" w:cs="Segoe UI Emoji"/>
+          <w:sz w:val="24"/>
+          <w:szCs w:val="24"/>
+          <w:lang w:eastAsia="pt-BR"/>
+        </w:rPr>
+      </w:pPr>
+      <w:r>
+        <w:rPr>
+          <w:rFonts w:ascii="Segoe UI Emoji" w:eastAsia="Times New Roman" w:hAnsi="Segoe UI Emoji" w:cs="Segoe UI Emoji"/>
+          <w:sz w:val="24"/>
+          <w:szCs w:val="24"/>
+          <w:lang w:eastAsia="pt-BR"/>
+        </w:rPr>
+        <w:t xml:space="preserve">3 – </w:t>
+      </w:r>
+      <w:proofErr w:type="gramStart"/>
+      <w:r>
+        <w:rPr>
+          <w:rFonts w:ascii="Segoe UI Emoji" w:eastAsia="Times New Roman" w:hAnsi="Segoe UI Emoji" w:cs="Segoe UI Emoji"/>
+          <w:sz w:val="24"/>
+          <w:szCs w:val="24"/>
+          <w:lang w:eastAsia="pt-BR"/>
+        </w:rPr>
+        <w:t>rodar</w:t>
+      </w:r>
+      <w:proofErr w:type="gramEnd"/>
+      <w:r>
+        <w:rPr>
+          <w:rFonts w:ascii="Segoe UI Emoji" w:eastAsia="Times New Roman" w:hAnsi="Segoe UI Emoji" w:cs="Segoe UI Emoji"/>
+          <w:sz w:val="24"/>
+          <w:szCs w:val="24"/>
+          <w:lang w:eastAsia="pt-BR"/>
+        </w:rPr>
+        <w:t xml:space="preserve"> a suíte de testes de </w:t>
+      </w:r>
+      <w:proofErr w:type="spellStart"/>
+      <w:r>
+        <w:rPr>
+          <w:rFonts w:ascii="Segoe UI Emoji" w:eastAsia="Times New Roman" w:hAnsi="Segoe UI Emoji" w:cs="Segoe UI Emoji"/>
+          <w:sz w:val="24"/>
+          <w:szCs w:val="24"/>
+          <w:lang w:eastAsia="pt-BR"/>
+        </w:rPr>
+        <w:t>endpoints</w:t>
+      </w:r>
+      <w:proofErr w:type="spellEnd"/>
+    </w:p>
+    <w:p>
+      <w:pPr>
+        <w:rPr>
+          <w:rFonts w:ascii="Segoe UI Emoji" w:eastAsia="Times New Roman" w:hAnsi="Segoe UI Emoji" w:cs="Segoe UI Emoji"/>
+          <w:sz w:val="24"/>
+          <w:szCs w:val="24"/>
+          <w:lang w:eastAsia="pt-BR"/>
+        </w:rPr>
+      </w:pPr>
+    </w:p>
+    <w:p>
+      <w:pPr>
+        <w:rPr>
+          <w:rFonts w:ascii="Segoe UI Emoji" w:eastAsia="Times New Roman" w:hAnsi="Segoe UI Emoji" w:cs="Segoe UI Emoji"/>
+          <w:sz w:val="24"/>
+          <w:szCs w:val="24"/>
+          <w:lang w:eastAsia="pt-BR"/>
+        </w:rPr>
+      </w:pPr>
+      <w:proofErr w:type="spellStart"/>
+      <w:r>
+        <w:rPr>
+          <w:rFonts w:ascii="Segoe UI Emoji" w:eastAsia="Times New Roman" w:hAnsi="Segoe UI Emoji" w:cs="Segoe UI Emoji"/>
+          <w:sz w:val="24"/>
+          <w:szCs w:val="24"/>
+          <w:lang w:eastAsia="pt-BR"/>
+        </w:rPr>
+        <w:t>Usuario@SANDESK-MICRO</w:t>
+      </w:r>
+      <w:proofErr w:type="spellEnd"/>
+      <w:r>
+        <w:rPr>
+          <w:rFonts w:ascii="Segoe UI Emoji" w:eastAsia="Times New Roman" w:hAnsi="Segoe UI Emoji" w:cs="Segoe UI Emoji"/>
+          <w:sz w:val="24"/>
+          <w:szCs w:val="24"/>
+          <w:lang w:eastAsia="pt-BR"/>
+        </w:rPr>
+        <w:t xml:space="preserve"> MINGW64 ~/eclipse-</w:t>
+      </w:r>
+      <w:proofErr w:type="spellStart"/>
+      <w:r>
+        <w:rPr>
+          <w:rFonts w:ascii="Segoe UI Emoji" w:eastAsia="Times New Roman" w:hAnsi="Segoe UI Emoji" w:cs="Segoe UI Emoji"/>
+          <w:sz w:val="24"/>
+          <w:szCs w:val="24"/>
+          <w:lang w:eastAsia="pt-BR"/>
+        </w:rPr>
+        <w:t>workspace</w:t>
+      </w:r>
+      <w:proofErr w:type="spellEnd"/>
+      <w:r>
+        <w:rPr>
+          <w:rFonts w:ascii="Segoe UI Emoji" w:eastAsia="Times New Roman" w:hAnsi="Segoe UI Emoji" w:cs="Segoe UI Emoji"/>
+          <w:sz w:val="24"/>
+          <w:szCs w:val="24"/>
+          <w:lang w:eastAsia="pt-BR"/>
+        </w:rPr>
+        <w:t>/multitenancy001/e2e/teste_v32.3 (</w:t>
+      </w:r>
+      <w:proofErr w:type="spellStart"/>
+      <w:r>
+        <w:rPr>
+          <w:rFonts w:ascii="Segoe UI Emoji" w:eastAsia="Times New Roman" w:hAnsi="Segoe UI Emoji" w:cs="Segoe UI Emoji"/>
+          <w:sz w:val="24"/>
+          <w:szCs w:val="24"/>
+          <w:lang w:eastAsia="pt-BR"/>
+        </w:rPr>
+        <w:t>main</w:t>
+      </w:r>
+      <w:proofErr w:type="spellEnd"/>
+      <w:r>
+        <w:rPr>
+          <w:rFonts w:ascii="Segoe UI Emoji" w:eastAsia="Times New Roman" w:hAnsi="Segoe UI Emoji" w:cs="Segoe UI Emoji"/>
+          <w:sz w:val="24"/>
+          <w:szCs w:val="24"/>
+          <w:lang w:eastAsia="pt-BR"/>
+        </w:rPr>
+        <w:t>)</w:t>
+      </w:r>
+    </w:p>
+    <w:p>
+      <w:pPr>
+        <w:rPr>
+          <w:rFonts w:ascii="Segoe UI Emoji" w:eastAsia="Times New Roman" w:hAnsi="Segoe UI Emoji" w:cs="Segoe UI Emoji"/>
+          <w:sz w:val="24"/>
+          <w:szCs w:val="24"/>
+          <w:lang w:eastAsia="pt-BR"/>
+        </w:rPr>
+      </w:pPr>
+      <w:r>
+        <w:rPr>
+          <w:rFonts w:ascii="Segoe UI Emoji" w:eastAsia="Times New Roman" w:hAnsi="Segoe UI Emoji" w:cs="Segoe UI Emoji"/>
+          <w:sz w:val="24"/>
+          <w:szCs w:val="24"/>
+          <w:lang w:eastAsia="pt-BR"/>
+        </w:rPr>
+        <w:t xml:space="preserve">$ </w:t>
+      </w:r>
+      <w:proofErr w:type="spellStart"/>
+      <w:r>
+        <w:rPr>
+          <w:rFonts w:ascii="Segoe UI Emoji" w:eastAsia="Times New Roman" w:hAnsi="Segoe UI Emoji" w:cs="Segoe UI Emoji"/>
+          <w:sz w:val="24"/>
+          <w:szCs w:val="24"/>
+          <w:lang w:eastAsia="pt-BR"/>
+        </w:rPr>
+        <w:t>chmod</w:t>
+      </w:r>
+      <w:proofErr w:type="spellEnd"/>
+      <w:r>
+        <w:rPr>
+          <w:rFonts w:ascii="Segoe UI Emoji" w:eastAsia="Times New Roman" w:hAnsi="Segoe UI Emoji" w:cs="Segoe UI Emoji"/>
+          <w:sz w:val="24"/>
+          <w:szCs w:val="24"/>
+          <w:lang w:eastAsia="pt-BR"/>
+        </w:rPr>
+        <w:t xml:space="preserve"> + *.</w:t>
+      </w:r>
+      <w:proofErr w:type="spellStart"/>
+      <w:r>
+        <w:rPr>
+          <w:rFonts w:ascii="Segoe UI Emoji" w:eastAsia="Times New Roman" w:hAnsi="Segoe UI Emoji" w:cs="Segoe UI Emoji"/>
+          <w:sz w:val="24"/>
+          <w:szCs w:val="24"/>
+          <w:lang w:eastAsia="pt-BR"/>
+        </w:rPr>
+        <w:t>sh</w:t>
+      </w:r>
+      <w:proofErr w:type="spellEnd"/>
+    </w:p>
+    <w:p>
+      <w:pPr>
+        <w:rPr>
+          <w:rFonts w:ascii="Segoe UI Emoji" w:eastAsia="Times New Roman" w:hAnsi="Segoe UI Emoji" w:cs="Segoe UI Emoji"/>
+          <w:sz w:val="24"/>
+          <w:szCs w:val="24"/>
+          <w:lang w:eastAsia="pt-BR"/>
+        </w:rPr>
+      </w:pPr>
+    </w:p>
+    <w:p>
+      <w:pPr>
+        <w:rPr>
+          <w:rFonts w:ascii="Segoe UI Emoji" w:eastAsia="Times New Roman" w:hAnsi="Segoe UI Emoji" w:cs="Segoe UI Emoji"/>
+          <w:sz w:val="24"/>
+          <w:szCs w:val="24"/>
+          <w:lang w:eastAsia="pt-BR"/>
+        </w:rPr>
+      </w:pPr>
+      <w:proofErr w:type="spellStart"/>
+      <w:r>
+        <w:rPr>
+          <w:rFonts w:ascii="Segoe UI Emoji" w:eastAsia="Times New Roman" w:hAnsi="Segoe UI Emoji" w:cs="Segoe UI Emoji"/>
+          <w:sz w:val="24"/>
+          <w:szCs w:val="24"/>
+          <w:lang w:eastAsia="pt-BR"/>
+        </w:rPr>
+        <w:t>Usuario@SANDESK-MICRO</w:t>
+      </w:r>
+      <w:proofErr w:type="spellEnd"/>
+      <w:r>
+        <w:rPr>
+          <w:rFonts w:ascii="Segoe UI Emoji" w:eastAsia="Times New Roman" w:hAnsi="Segoe UI Emoji" w:cs="Segoe UI Emoji"/>
+          <w:sz w:val="24"/>
+          <w:szCs w:val="24"/>
+          <w:lang w:eastAsia="pt-BR"/>
+        </w:rPr>
+        <w:t xml:space="preserve"> MINGW64 ~/eclipse-</w:t>
+      </w:r>
+      <w:proofErr w:type="spellStart"/>
+      <w:r>
+        <w:rPr>
+          <w:rFonts w:ascii="Segoe UI Emoji" w:eastAsia="Times New Roman" w:hAnsi="Segoe UI Emoji" w:cs="Segoe UI Emoji"/>
+          <w:sz w:val="24"/>
+          <w:szCs w:val="24"/>
+          <w:lang w:eastAsia="pt-BR"/>
+        </w:rPr>
+        <w:t>workspace</w:t>
+      </w:r>
+      <w:proofErr w:type="spellEnd"/>
+      <w:r>
+        <w:rPr>
+          <w:rFonts w:ascii="Segoe UI Emoji" w:eastAsia="Times New Roman" w:hAnsi="Segoe UI Emoji" w:cs="Segoe UI Emoji"/>
+          <w:sz w:val="24"/>
+          <w:szCs w:val="24"/>
+          <w:lang w:eastAsia="pt-BR"/>
+        </w:rPr>
+        <w:t>/multitenancy001/e2e/teste_v32.3 (</w:t>
+      </w:r>
+      <w:proofErr w:type="spellStart"/>
+      <w:r>
+        <w:rPr>
+          <w:rFonts w:ascii="Segoe UI Emoji" w:eastAsia="Times New Roman" w:hAnsi="Segoe UI Emoji" w:cs="Segoe UI Emoji"/>
+          <w:sz w:val="24"/>
+          <w:szCs w:val="24"/>
+          <w:lang w:eastAsia="pt-BR"/>
+        </w:rPr>
+        <w:t>main</w:t>
+      </w:r>
+      <w:proofErr w:type="spellEnd"/>
+      <w:r>
+        <w:rPr>
+          <w:rFonts w:ascii="Segoe UI Emoji" w:eastAsia="Times New Roman" w:hAnsi="Segoe UI Emoji" w:cs="Segoe UI Emoji"/>
+          <w:sz w:val="24"/>
+          <w:szCs w:val="24"/>
+          <w:lang w:eastAsia="pt-BR"/>
+        </w:rPr>
+        <w:t>)</w:t>
+      </w:r>
+    </w:p>
+    <w:p>
+      <w:pPr>
+        <w:rPr>
+          <w:rFonts w:ascii="Segoe UI Emoji" w:eastAsia="Times New Roman" w:hAnsi="Segoe UI Emoji" w:cs="Segoe UI Emoji"/>
+          <w:sz w:val="24"/>
+          <w:szCs w:val="24"/>
+          <w:lang w:eastAsia="pt-BR"/>
+        </w:rPr>
+      </w:pPr>
+      <w:r>
+        <w:rPr>
+          <w:rFonts w:ascii="Segoe UI Emoji" w:eastAsia="Times New Roman" w:hAnsi="Segoe UI Emoji" w:cs="Segoe UI Emoji"/>
+          <w:sz w:val="24"/>
+          <w:szCs w:val="24"/>
+          <w:lang w:eastAsia="pt-BR"/>
+        </w:rPr>
+        <w:t>$ ./run-teste-v32.2-strict.sh</w:t>
+      </w:r>
+    </w:p>
+    <w:p>
+      <w:pPr>
+        <w:rPr>
+          <w:rFonts w:ascii="Segoe UI Emoji" w:eastAsia="Times New Roman" w:hAnsi="Segoe UI Emoji" w:cs="Segoe UI Emoji"/>
+          <w:sz w:val="24"/>
+          <w:szCs w:val="24"/>
+          <w:lang w:eastAsia="pt-BR"/>
+        </w:rPr>
+      </w:pPr>
+    </w:p>
+    <w:p>
+      <w:pPr>
+        <w:rPr>
+          <w:rFonts w:ascii="Segoe UI Emoji" w:eastAsia="Times New Roman" w:hAnsi="Segoe UI Emoji" w:cs="Segoe UI Emoji"/>
+          <w:sz w:val="24"/>
+          <w:szCs w:val="24"/>
+          <w:lang w:eastAsia="pt-BR"/>
+        </w:rPr>
+      </w:pPr>
+    </w:p>
     <w:p>
       <w:pPr>
         <w:rPr>

</xml_diff>